<commit_message>
feat: destacar autoría Yohaldo Edmundo Vega Quinto (U22212893) UTP Lima Centro
</commit_message>
<xml_diff>
--- a/informe_laboratorio.docx
+++ b/informe_laboratorio.docx
@@ -89,7 +89,7 @@
               <w:t xml:space="preserve">Creador: </w:t>
             </w:r>
             <w:r>
-              <w:t xml:space="preserve">Yohaldo Vega Quinto</w:t>
+              <w:t xml:space="preserve">Yohaldo Edmundo Vega Quinto</w:t>
             </w:r>
           </w:p>
           <w:p>
@@ -98,10 +98,22 @@
                 <w:b/>
                 <w:bCs/>
               </w:rPr>
+              <w:t xml:space="preserve">Código Estudiante: </w:t>
+            </w:r>
+            <w:r>
+              <w:t xml:space="preserve">U22212893</w:t>
+            </w:r>
+          </w:p>
+          <w:p>
+            <w:r>
+              <w:rPr>
+                <w:b/>
+                <w:bCs/>
+              </w:rPr>
               <w:t xml:space="preserve">Institución: </w:t>
             </w:r>
             <w:r>
-              <w:t xml:space="preserve">UTP Lima Centro</w:t>
+              <w:t xml:space="preserve">UTP Sede Lima Centro</w:t>
             </w:r>
           </w:p>
           <w:p>
@@ -158,7 +170,7 @@
                 <w:sz w:val="22"/>
                 <w:szCs w:val="22"/>
               </w:rPr>
-              <w:t xml:space="preserve">💡 DATOS DEL CREADOR DEL PROYECTO
+              <w:t xml:space="preserve">💡 AUTORÍA Y DATOS DEL CREADOR
 </w:t>
             </w:r>
             <w:r>
@@ -170,8 +182,10 @@
                 <w:sz w:val="21"/>
                 <w:szCs w:val="21"/>
               </w:rPr>
-              <w:t xml:space="preserve">Desarrollador / Autor: Yohaldo Vega Quinto
-Institución: Universidad Tecnológica del Perú (UTP) - Sede Lima Centro
+              <w:t xml:space="preserve">Estudiante / Desarrollador: Yohaldo Edmundo Vega Quinto
+Código Universitario: U22212893
+Universidad: Universidad Tecnológica del Perú (UTP) - Sede Lima Centro
+Curso: Tecnologías de la Información y Comunicación (T.I.C.) - Examen Práctico 2
 Proyecto: Implementación y Adaptación de Asistente de Productividad Empresarial con Google Gemini API y JavaScript</w:t>
             </w:r>
           </w:p>

</xml_diff>